<commit_message>
Version inicial del proyecto Abstract Factory
</commit_message>
<xml_diff>
--- a/documentacion/trab01_colgii61_act_Akers.docx
+++ b/documentacion/trab01_colgii61_act_Akers.docx
@@ -655,7 +655,7 @@
           </mc:Choice>
           <mc:Fallback>
             <w:pict>
-              <v:rect w14:anchorId="064FDCF9" id="Rectángulo 1" o:spid="_x0000_s1026" style="position:absolute;margin-left:452.75pt;margin-top:-37.6pt;width:23.55pt;height:13.85pt;z-index:251657728;visibility:visible;mso-wrap-style:square;mso-wrap-distance-left:9pt;mso-wrap-distance-top:0;mso-wrap-distance-right:9pt;mso-wrap-distance-bottom:0;mso-position-horizontal:absolute;mso-position-horizontal-relative:text;mso-position-vertical:absolute;mso-position-vertical-relative:text;v-text-anchor:middle" o:gfxdata="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" fillcolor="white [3212]" strokecolor="white [3212]" strokeweight="2pt"/>
+              <v:rect w14:anchorId="7F9649AC" id="Rectángulo 1" o:spid="_x0000_s1026" style="position:absolute;margin-left:452.75pt;margin-top:-37.6pt;width:23.55pt;height:13.85pt;z-index:251657728;visibility:visible;mso-wrap-style:square;mso-wrap-distance-left:9pt;mso-wrap-distance-top:0;mso-wrap-distance-right:9pt;mso-wrap-distance-bottom:0;mso-position-horizontal:absolute;mso-position-horizontal-relative:text;mso-position-vertical:absolute;mso-position-vertical-relative:text;v-text-anchor:middle" o:gfxdata="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" fillcolor="white [3212]" strokecolor="white [3212]" strokeweight="2pt"/>
             </w:pict>
           </mc:Fallback>
         </mc:AlternateContent>
@@ -782,7 +782,7 @@
         </w:rPr>
         <w:fldChar w:fldCharType="separate"/>
       </w:r>
-      <w:hyperlink w:anchor="_Toc243924059" w:history="1">
+      <w:hyperlink w:anchor="_Toc244282894" w:history="1">
         <w:r>
           <w:rPr>
             <w:rStyle w:val="Hipervnculo"/>
@@ -810,7 +810,7 @@
             <w:noProof/>
             <w:webHidden/>
           </w:rPr>
-          <w:instrText xml:space="preserve"> PAGEREF _Toc243924059 \h </w:instrText>
+          <w:instrText xml:space="preserve"> PAGEREF _Toc244282894 \h </w:instrText>
         </w:r>
         <w:r>
           <w:rPr>
@@ -855,7 +855,7 @@
           <w:lang w:eastAsia="zh-CN"/>
         </w:rPr>
       </w:pPr>
-      <w:hyperlink w:anchor="_Toc243924060" w:history="1">
+      <w:hyperlink w:anchor="_Toc244282895" w:history="1">
         <w:r>
           <w:rPr>
             <w:rStyle w:val="Hipervnculo"/>
@@ -883,7 +883,7 @@
             <w:noProof/>
             <w:webHidden/>
           </w:rPr>
-          <w:instrText xml:space="preserve"> PAGEREF _Toc243924060 \h </w:instrText>
+          <w:instrText xml:space="preserve"> PAGEREF _Toc244282895 \h </w:instrText>
         </w:r>
         <w:r>
           <w:rPr>
@@ -928,7 +928,7 @@
           <w:lang w:eastAsia="zh-CN"/>
         </w:rPr>
       </w:pPr>
-      <w:hyperlink w:anchor="_Toc243924061" w:history="1">
+      <w:hyperlink w:anchor="_Toc244282896" w:history="1">
         <w:r>
           <w:rPr>
             <w:rStyle w:val="Hipervnculo"/>
@@ -956,7 +956,7 @@
             <w:noProof/>
             <w:webHidden/>
           </w:rPr>
-          <w:instrText xml:space="preserve"> PAGEREF _Toc243924061 \h </w:instrText>
+          <w:instrText xml:space="preserve"> PAGEREF _Toc244282896 \h </w:instrText>
         </w:r>
         <w:r>
           <w:rPr>
@@ -1001,7 +1001,7 @@
           <w:lang w:eastAsia="zh-CN"/>
         </w:rPr>
       </w:pPr>
-      <w:hyperlink w:anchor="_Toc243924062" w:history="1">
+      <w:hyperlink w:anchor="_Toc244282897" w:history="1">
         <w:r>
           <w:rPr>
             <w:rStyle w:val="Hipervnculo"/>
@@ -1029,7 +1029,7 @@
             <w:noProof/>
             <w:webHidden/>
           </w:rPr>
-          <w:instrText xml:space="preserve"> PAGEREF _Toc243924062 \h </w:instrText>
+          <w:instrText xml:space="preserve"> PAGEREF _Toc244282897 \h </w:instrText>
         </w:r>
         <w:r>
           <w:rPr>
@@ -1074,7 +1074,7 @@
           <w:lang w:eastAsia="zh-CN"/>
         </w:rPr>
       </w:pPr>
-      <w:hyperlink w:anchor="_Toc243924063" w:history="1">
+      <w:hyperlink w:anchor="_Toc244282898" w:history="1">
         <w:r>
           <w:rPr>
             <w:rStyle w:val="Hipervnculo"/>
@@ -1102,7 +1102,7 @@
             <w:noProof/>
             <w:webHidden/>
           </w:rPr>
-          <w:instrText xml:space="preserve"> PAGEREF _Toc243924063 \h </w:instrText>
+          <w:instrText xml:space="preserve"> PAGEREF _Toc244282898 \h </w:instrText>
         </w:r>
         <w:r>
           <w:rPr>
@@ -1147,7 +1147,7 @@
           <w:lang w:eastAsia="zh-CN"/>
         </w:rPr>
       </w:pPr>
-      <w:hyperlink w:anchor="_Toc243924064" w:history="1">
+      <w:hyperlink w:anchor="_Toc244282899" w:history="1">
         <w:r>
           <w:rPr>
             <w:rStyle w:val="Hipervnculo"/>
@@ -1175,7 +1175,7 @@
             <w:noProof/>
             <w:webHidden/>
           </w:rPr>
-          <w:instrText xml:space="preserve"> PAGEREF _Toc243924064 \h </w:instrText>
+          <w:instrText xml:space="preserve"> PAGEREF _Toc244282899 \h </w:instrText>
         </w:r>
         <w:r>
           <w:rPr>
@@ -1195,7 +1195,7 @@
             <w:noProof/>
             <w:webHidden/>
           </w:rPr>
-          <w:t>xi</w:t>
+          <w:t>xii</w:t>
         </w:r>
         <w:r>
           <w:rPr>
@@ -1220,7 +1220,7 @@
           <w:lang w:eastAsia="zh-CN"/>
         </w:rPr>
       </w:pPr>
-      <w:hyperlink w:anchor="_Toc243924065" w:history="1">
+      <w:hyperlink w:anchor="_Toc244282900" w:history="1">
         <w:r>
           <w:rPr>
             <w:rStyle w:val="Hipervnculo"/>
@@ -1247,7 +1247,7 @@
             <w:noProof/>
             <w:webHidden/>
           </w:rPr>
-          <w:instrText xml:space="preserve"> PAGEREF _Toc243924065 \h </w:instrText>
+          <w:instrText xml:space="preserve"> PAGEREF _Toc244282900 \h </w:instrText>
         </w:r>
         <w:r>
           <w:rPr>
@@ -1267,7 +1267,7 @@
             <w:noProof/>
             <w:webHidden/>
           </w:rPr>
-          <w:t>xi</w:t>
+          <w:t>xiii</w:t>
         </w:r>
         <w:r>
           <w:rPr>
@@ -1354,7 +1354,7 @@
           <w:lang w:val="es-ES"/>
         </w:rPr>
       </w:pPr>
-      <w:bookmarkStart w:id="1" w:name="_Toc243924059"/>
+      <w:bookmarkStart w:id="1" w:name="_Toc244282894"/>
       <w:r>
         <w:rPr>
           <w:lang w:val="es-ES"/>
@@ -1762,7 +1762,7 @@
           <w:lang w:val="es-ES"/>
         </w:rPr>
       </w:pPr>
-      <w:bookmarkStart w:id="2" w:name="_Toc243924060"/>
+      <w:bookmarkStart w:id="2" w:name="_Toc244282895"/>
       <w:r>
         <w:rPr>
           <w:lang w:val="es-ES"/>
@@ -1799,11 +1799,14 @@
       <w:pPr>
         <w:pStyle w:val="Codigo"/>
         <w:ind w:left="170"/>
-      </w:pPr>
-      <w:r>
         <w:rPr>
           <w:lang w:val="es-CO"/>
         </w:rPr>
+      </w:pPr>
+      <w:r>
+        <w:rPr>
+          <w:lang w:val="es-CO"/>
+        </w:rPr>
         <w:tab/>
       </w:r>
       <w:r>
@@ -1819,6 +1822,9 @@
         <w:tab/>
       </w:r>
       <w:r>
+        <w:rPr>
+          <w:lang w:val="es-CO"/>
+        </w:rPr>
         <w:t>if categoria == "ENT" and tipo == "FAC":</w:t>
       </w:r>
     </w:p>
@@ -1831,24 +1837,34 @@
         </w:rPr>
       </w:pPr>
       <w:r>
+        <w:rPr>
+          <w:lang w:val="es-CO"/>
+        </w:rPr>
         <w:t xml:space="preserve">    </w:t>
       </w:r>
       <w:r>
+        <w:rPr>
+          <w:lang w:val="es-CO"/>
+        </w:rPr>
         <w:tab/>
       </w:r>
       <w:r>
+        <w:rPr>
+          <w:lang w:val="es-CO"/>
+        </w:rPr>
         <w:tab/>
       </w:r>
       <w:r>
+        <w:rPr>
+          <w:lang w:val="es-CO"/>
+        </w:rPr>
         <w:tab/>
       </w:r>
       <w:r>
+        <w:rPr>
+          <w:lang w:val="es-CO"/>
+        </w:rPr>
         <w:tab/>
-      </w:r>
-      <w:r>
-        <w:rPr>
-          <w:lang w:val="es-CO"/>
-        </w:rPr>
         <w:t>informe = FacturaEntrada()</w:t>
       </w:r>
     </w:p>
@@ -2588,7 +2604,7 @@
           <w:lang w:val="es-ES"/>
         </w:rPr>
       </w:pPr>
-      <w:bookmarkStart w:id="3" w:name="_Toc243924061"/>
+      <w:bookmarkStart w:id="3" w:name="_Toc244282896"/>
       <w:r>
         <w:rPr>
           <w:lang w:val="es-ES"/>
@@ -3480,7 +3496,7 @@
           <w:lang w:val="es-ES"/>
         </w:rPr>
       </w:pPr>
-      <w:bookmarkStart w:id="4" w:name="_Toc243924062"/>
+      <w:bookmarkStart w:id="4" w:name="_Toc244282897"/>
       <w:r>
         <w:rPr>
           <w:lang w:val="es-ES"/>
@@ -3997,7 +4013,7 @@
           <w:lang w:val="es-ES"/>
         </w:rPr>
       </w:pPr>
-      <w:bookmarkStart w:id="5" w:name="_Toc243924063"/>
+      <w:bookmarkStart w:id="5" w:name="_Toc244282898"/>
       <w:r>
         <w:rPr>
           <w:lang w:val="es-ES"/>
@@ -4272,7 +4288,7 @@
           <w:lang w:val="es-ES"/>
         </w:rPr>
       </w:pPr>
-      <w:bookmarkStart w:id="6" w:name="_Toc243924064"/>
+      <w:bookmarkStart w:id="6" w:name="_Toc244282899"/>
       <w:r>
         <w:rPr>
           <w:lang w:val="es-ES"/>
@@ -5022,26 +5038,24 @@
           <w:lang w:val="es-ES"/>
         </w:rPr>
       </w:pPr>
-      <w:bookmarkStart w:id="7" w:name="_GoBack"/>
+      <w:r>
+        <w:tab/>
+      </w:r>
+      <w:r>
+        <w:t xml:space="preserve"> </w:t>
+      </w:r>
+    </w:p>
+    <w:p>
+      <w:pPr>
+        <w:pStyle w:val="Ttulo1"/>
+      </w:pPr>
+      <w:bookmarkStart w:id="7" w:name="_Toc131502444"/>
+      <w:bookmarkStart w:id="8" w:name="_Toc244282900"/>
+      <w:r>
+        <w:t>Referencias bibliográficas</w:t>
+      </w:r>
       <w:bookmarkEnd w:id="7"/>
-      <w:r>
-        <w:tab/>
-      </w:r>
-      <w:r>
-        <w:t xml:space="preserve"> </w:t>
-      </w:r>
-    </w:p>
-    <w:p>
-      <w:pPr>
-        <w:pStyle w:val="Ttulo1"/>
-      </w:pPr>
-      <w:bookmarkStart w:id="8" w:name="_Toc131502444"/>
-      <w:bookmarkStart w:id="9" w:name="_Toc243924065"/>
-      <w:r>
-        <w:t>Referencias bibliográficas</w:t>
-      </w:r>
       <w:bookmarkEnd w:id="8"/>
-      <w:bookmarkEnd w:id="9"/>
     </w:p>
     <w:p>
       <w:pPr>
@@ -5052,9 +5066,6 @@
         </w:rPr>
       </w:pPr>
       <w:r>
-        <w:rPr>
-          <w:lang w:val="en-US"/>
-        </w:rPr>
         <w:t xml:space="preserve">Gamma, E., Helm, R., Johnson, R., &amp; Vlissides, J. (1994). </w:t>
       </w:r>
       <w:r>
@@ -5149,12 +5160,14 @@
       <w:pPr>
         <w:ind w:hanging="720"/>
       </w:pPr>
+      <w:bookmarkStart w:id="9" w:name="_GoBack"/>
       <w:r>
         <w:t xml:space="preserve">Repositorio: </w:t>
       </w:r>
       <w:r>
         <w:t>https://github.com/ajohniba/UNIR-Reutilizacion-Software</w:t>
       </w:r>
+      <w:bookmarkEnd w:id="9"/>
     </w:p>
     <w:sectPr>
       <w:headerReference w:type="even" r:id="rId14"/>
@@ -10440,7 +10453,7 @@
 </file>
 
 <file path=customXml/itemProps1.xml><?xml version="1.0" encoding="utf-8"?>
-<ds:datastoreItem xmlns:ds="http://schemas.openxmlformats.org/officeDocument/2006/customXml" ds:itemID="{998E7AF1-7025-434C-A0AD-1864E05F04CE}">
+<ds:datastoreItem xmlns:ds="http://schemas.openxmlformats.org/officeDocument/2006/customXml" ds:itemID="{CC13CD32-96F2-41AE-A49F-7066F56F8580}">
   <ds:schemaRefs>
     <ds:schemaRef ds:uri="http://schemas.openxmlformats.org/officeDocument/2006/bibliography"/>
   </ds:schemaRefs>

</xml_diff>